<commit_message>
0.5.53: turnover150, the stringout builds and an HDRI delivers its mp4
- The stringout read a cut by the file's own timecode alone; C2098.MP4's
  is six seconds off Resolve's Start TC, so it asked for frames before
  the file began. Scan and stringout now share scan.cut_in_file.
- An HDRI or LDRI delivers only its pre-render as an mp4. The EXR or
  image is Ben's to deliver by hand and is never looked for; QC-086 is
  retired. The tracker's HDRI column names the mp4.
- A shot's colorChart02 is no longer folded into its colorChart01.
- A stringout segment whose file decodes a frame or two short holds its
  last frame instead of failing the stringout.

Verified on Windows against the turnover150 folder on G: 10,787 frames.

Co-Authored-By: Claude Opus 5.5 (1M context) <noreply@anthropic.com>
</commit_message>
<xml_diff>
--- a/docs/Shot_Types.docx
+++ b/docs/Shot_Types.docx
@@ -1487,7 +1487,7 @@
                 <w:color w:val="1F2937"/>
                 <w:sz w:val="18"/>
               </w:rPr>
-              <w:t>Copied</w:t>
+              <w:t>As the stringout</w:t>
             </w:r>
           </w:p>
         </w:tc>
@@ -1506,7 +1506,7 @@
                 <w:color w:val="1F2937"/>
                 <w:sz w:val="18"/>
               </w:rPr>
-              <w:t>The EXR as it is, and an mp4 of its pre-render</w:t>
+              <w:t>An mp4 of its pre-render. The EXR is delivered by Ben</w:t>
             </w:r>
           </w:p>
         </w:tc>
@@ -1625,7 +1625,7 @@
                 <w:color w:val="1F2937"/>
                 <w:sz w:val="18"/>
               </w:rPr>
-              <w:t>Copied</w:t>
+              <w:t>Never</w:t>
             </w:r>
           </w:p>
         </w:tc>
@@ -1644,7 +1644,7 @@
                 <w:color w:val="1F2937"/>
                 <w:sz w:val="18"/>
               </w:rPr>
-              <w:t>The image as it is, and an mp4 of its pre-render</w:t>
+              <w:t>An mp4 of its pre-render. The image is delivered by Ben</w:t>
             </w:r>
           </w:p>
         </w:tc>
@@ -5214,7 +5214,7 @@
                 <w:color w:val="1F2937"/>
                 <w:sz w:val="19"/>
               </w:rPr>
-              <w:t>The EXR, with Ben's pre-render of its timeline event beside it (</w:t>
+              <w:t xml:space="preserve">Ben's pre-render of its timeline event, a movie in the turnover folder (for example </w:t>
             </w:r>
             <w:r>
               <w:rPr>
@@ -5223,7 +5223,7 @@
                 <w:color w:val="1F2937"/>
                 <w:sz w:val="18"/>
               </w:rPr>
-              <w:t>&lt;EXR name&gt; Render 1.mov</w:t>
+              <w:t>INCA3001_pl01_HDRI01_Render.mov</w:t>
             </w:r>
             <w:r>
               <w:rPr>
@@ -5231,7 +5231,7 @@
                 <w:color w:val="1F2937"/>
                 <w:sz w:val="19"/>
               </w:rPr>
-              <w:t>).</w:t>
+              <w:t>). The EXR is not looked for.</w:t>
             </w:r>
           </w:p>
         </w:tc>
@@ -5275,7 +5275,7 @@
                 <w:color w:val="1F2937"/>
                 <w:sz w:val="19"/>
               </w:rPr>
-              <w:t>The EXR is copied byte for byte. The pre-render's mp4 carries the HDRI's grade, as the stringout shows it.</w:t>
+              <w:t>The pre-render's mp4 carries the HDRI's grade, as the stringout shows it.</w:t>
             </w:r>
           </w:p>
         </w:tc>
@@ -5320,7 +5320,15 @@
                 <w:color w:val="1F2937"/>
                 <w:sz w:val="18"/>
               </w:rPr>
-              <w:t>INCA5002_pl01_HDRI01_v01.exr</w:t>
+              <w:t>INCA5002_pl01_HDRI01_v01.mp4</w:t>
+            </w:r>
+            <w:r>
+              <w:rPr>
+                <w:b w:val="0"/>
+                <w:color w:val="1F2937"/>
+                <w:sz w:val="19"/>
+              </w:rPr>
+              <w:t xml:space="preserve"> (its pre-render)</w:t>
             </w:r>
           </w:p>
           <w:p>
@@ -5329,20 +5337,11 @@
             </w:pPr>
             <w:r>
               <w:rPr>
-                <w:rFonts w:ascii="Consolas" w:hAnsi="Consolas"/>
-                <w:b w:val="0"/>
-                <w:color w:val="1F2937"/>
-                <w:sz w:val="18"/>
-              </w:rPr>
-              <w:t>INCA5002_pl01_HDRI01_v01.mp4</w:t>
-            </w:r>
-            <w:r>
-              <w:rPr>
                 <w:b w:val="0"/>
                 <w:color w:val="1F2937"/>
                 <w:sz w:val="19"/>
               </w:rPr>
-              <w:t xml:space="preserve"> (its pre-render, when there is one)</w:t>
+              <w:t>The EXR is not delivered by the tool: Ben delivers it by hand, before or after.</w:t>
             </w:r>
           </w:p>
         </w:tc>
@@ -5403,7 +5402,7 @@
                 <w:color w:val="1F2937"/>
                 <w:sz w:val="19"/>
               </w:rPr>
-              <w:t>. With no pre-render, the EXR is held.</w:t>
+              <w:t>. With no pre-render in the folder, the event is black and no mp4 is delivered.</w:t>
             </w:r>
           </w:p>
         </w:tc>
@@ -5447,7 +5446,7 @@
                 <w:color w:val="1F2937"/>
                 <w:sz w:val="19"/>
               </w:rPr>
-              <w:t>The HDRI column, with the delivered name.</w:t>
+              <w:t>The HDRI column, with the mp4's name.</w:t>
             </w:r>
           </w:p>
         </w:tc>
@@ -5632,58 +5631,7 @@
                 <w:color w:val="1F2937"/>
                 <w:sz w:val="19"/>
               </w:rPr>
-              <w:t xml:space="preserve">A </w:t>
-            </w:r>
-            <w:r>
-              <w:rPr>
-                <w:rFonts w:ascii="Consolas" w:hAnsi="Consolas"/>
-                <w:b w:val="0"/>
-                <w:color w:val="1F2937"/>
-                <w:sz w:val="18"/>
-              </w:rPr>
-              <w:t>.jpg</w:t>
-            </w:r>
-            <w:r>
-              <w:rPr>
-                <w:b w:val="0"/>
-                <w:color w:val="1F2937"/>
-                <w:sz w:val="19"/>
-              </w:rPr>
-              <w:t xml:space="preserve">, </w:t>
-            </w:r>
-            <w:r>
-              <w:rPr>
-                <w:rFonts w:ascii="Consolas" w:hAnsi="Consolas"/>
-                <w:b w:val="0"/>
-                <w:color w:val="1F2937"/>
-                <w:sz w:val="18"/>
-              </w:rPr>
-              <w:t>.jpeg</w:t>
-            </w:r>
-            <w:r>
-              <w:rPr>
-                <w:b w:val="0"/>
-                <w:color w:val="1F2937"/>
-                <w:sz w:val="19"/>
-              </w:rPr>
-              <w:t xml:space="preserve"> or </w:t>
-            </w:r>
-            <w:r>
-              <w:rPr>
-                <w:rFonts w:ascii="Consolas" w:hAnsi="Consolas"/>
-                <w:b w:val="0"/>
-                <w:color w:val="1F2937"/>
-                <w:sz w:val="18"/>
-              </w:rPr>
-              <w:t>.png</w:t>
-            </w:r>
-            <w:r>
-              <w:rPr>
-                <w:b w:val="0"/>
-                <w:color w:val="1F2937"/>
-                <w:sz w:val="19"/>
-              </w:rPr>
-              <w:t>, with its pre-render beside it.</w:t>
+              <w:t>Ben's pre-render of its timeline event. The JPG or PNG is not looked for.</w:t>
             </w:r>
           </w:p>
         </w:tc>
@@ -5727,7 +5675,7 @@
                 <w:color w:val="1F2937"/>
                 <w:sz w:val="19"/>
               </w:rPr>
-              <w:t>Copied byte for byte. Its pre-render's mp4 is never graded.</w:t>
+              <w:t>Its pre-render's mp4 is never graded.</w:t>
             </w:r>
           </w:p>
         </w:tc>
@@ -5772,7 +5720,7 @@
                 <w:color w:val="1F2937"/>
                 <w:sz w:val="18"/>
               </w:rPr>
-              <w:t>INCA5002_pl01_LDRI01_v01.jpg</w:t>
+              <w:t>INCA5002_pl01_LDRI01_v01.mp4</w:t>
             </w:r>
             <w:r>
               <w:rPr>
@@ -5780,7 +5728,7 @@
                 <w:color w:val="1F2937"/>
                 <w:sz w:val="19"/>
               </w:rPr>
-              <w:t xml:space="preserve"> (its own extension)</w:t>
+              <w:t xml:space="preserve"> (its pre-render)</w:t>
             </w:r>
           </w:p>
           <w:p>
@@ -5789,20 +5737,11 @@
             </w:pPr>
             <w:r>
               <w:rPr>
-                <w:rFonts w:ascii="Consolas" w:hAnsi="Consolas"/>
-                <w:b w:val="0"/>
-                <w:color w:val="1F2937"/>
-                <w:sz w:val="18"/>
-              </w:rPr>
-              <w:t>INCA5002_pl01_LDRI01_v01.mp4</w:t>
-            </w:r>
-            <w:r>
-              <w:rPr>
                 <w:b w:val="0"/>
                 <w:color w:val="1F2937"/>
                 <w:sz w:val="19"/>
               </w:rPr>
-              <w:t xml:space="preserve"> (its pre-render, when there is one)</w:t>
+              <w:t>The JPG or PNG is not delivered by the tool: Ben delivers it by hand.</w:t>
             </w:r>
           </w:p>
         </w:tc>
@@ -5846,7 +5785,7 @@
                 <w:color w:val="1F2937"/>
                 <w:sz w:val="19"/>
               </w:rPr>
-              <w:t xml:space="preserve">Its pre-render, or the image held, as it is. Burned in </w:t>
+              <w:t xml:space="preserve">Its pre-render, as it is. Burned in </w:t>
             </w:r>
             <w:r>
               <w:rPr>

</xml_diff>